<commit_message>
docs: README al 29-10, diagramas, anexo A v1.5 y documento 12 v1.1
</commit_message>
<xml_diff>
--- a/Fase 2/Evidencias Proyecto/Evidencias de documentación/Listado de documentos/12_Evidencias_Tecnicas_de_Diseno.docx
+++ b/Fase 2/Evidencias Proyecto/Evidencias de documentación/Listado de documentos/12_Evidencias_Tecnicas_de_Diseno.docx
@@ -349,7 +349,7 @@
                 <w:sz w:val="17"/>
                 <w:szCs w:val="17"/>
               </w:rPr>
-              <w:t xml:space="preserve">1.0 · 27-09-2026 · secciones 3 y 6 actualizadas al 01-10-2026</w:t>
+              <w:t xml:space="preserve">1.1 · 23-10-2026. La 1.0 es del 27-09, con las secciones 3 y 6 al 01-10-2026</w:t>
             </w:r>
           </w:p>
         </w:tc>
@@ -421,7 +421,7 @@
                 <w:sz w:val="17"/>
                 <w:szCs w:val="17"/>
               </w:rPr>
-              <w:t xml:space="preserve">Vigente. Los diagramas de casos de uso, de clases, de secuencia y de despliegue son nuevos (27-09) y conviene que el equipo los revise.</w:t>
+              <w:t xml:space="preserve">Vigente. La versión 1.1 pone al día el estado de cada evidencia con develop al 23-10 y rehace las figuras 2, 4 a 8, 10 y 12 a 14 con el modelo implementado y la decisión AD-12. Conviene que el equipo revise los diagramas UML.</w:t>
             </w:r>
           </w:p>
         </w:tc>
@@ -493,7 +493,7 @@
                 <w:sz w:val="17"/>
                 <w:szCs w:val="17"/>
               </w:rPr>
-              <w:t xml:space="preserve">Pilar 2 v1.7 y su anexo A v1.4 · Pilar 1 v1.7 (RNF) · Pilar 5 v1.5 (pruebas e integración continua) · repositorio al 27-09 (docker-compose.yml, README y .github/workflows)</w:t>
+              <w:t xml:space="preserve">Pilar 2 v1.7 y su anexo A v1.5 · Pilar 1 v1.7 (RNF) · Pilar 5 v1.5 (pruebas e integración continua) · repositorio al 23-10, develop hasta el PR #18 (docker-compose.yml, README, .github/workflows y los modelos de cada servicio)</w:t>
             </w:r>
           </w:p>
         </w:tc>
@@ -641,7 +641,7 @@
                 <w:sz w:val="16"/>
                 <w:szCs w:val="16"/>
               </w:rPr>
-              <w:t xml:space="preserve">Estado al 27-09</w:t>
+              <w:t xml:space="preserve">Estado al 23-10</w:t>
             </w:r>
           </w:p>
         </w:tc>
@@ -849,7 +849,7 @@
                 <w:sz w:val="16"/>
                 <w:szCs w:val="16"/>
               </w:rPr>
-              <w:t xml:space="preserve">Vigente; los contratos OpenAPI se escriben al abrir cada sprint (docs/api, pendiente HU-03)</w:t>
+              <w:t xml:space="preserve">Diseño vigente; las llamadas internas llegan con HU-14, HU-21, HU-23 y HU-28. Contratos OpenAPI de Identidad y Tutorías en docs/api; faltan el de Catálogo y el de Pagos, que llega con HU-23</w:t>
             </w:r>
           </w:p>
         </w:tc>
@@ -953,7 +953,7 @@
                 <w:sz w:val="16"/>
                 <w:szCs w:val="16"/>
               </w:rPr>
-              <w:t xml:space="preserve">Vigente para 10 de los 12 contenedores; faltan frontend (HU-06) y programador (HU-37)</w:t>
+              <w:t xml:space="preserve">Vigente para 10 de los 11 contenedores; falta el programador (HU-37). Las páginas no llevan contenedor (AD-12)</w:t>
             </w:r>
           </w:p>
         </w:tc>
@@ -1057,7 +1057,7 @@
                 <w:sz w:val="16"/>
                 <w:szCs w:val="16"/>
               </w:rPr>
-              <w:t xml:space="preserve">Vigente (aprobado el 14-09)</w:t>
+              <w:t xml:space="preserve">Vigente: anexo A v1.5 (23-10), con el modelo implementado</w:t>
             </w:r>
           </w:p>
         </w:tc>
@@ -1161,7 +1161,7 @@
                 <w:sz w:val="16"/>
                 <w:szCs w:val="16"/>
               </w:rPr>
-              <w:t xml:space="preserve">Nuevo, a revisar</w:t>
+              <w:t xml:space="preserve">Del 27-09, a revisar</w:t>
             </w:r>
           </w:p>
         </w:tc>
@@ -1265,7 +1265,7 @@
                 <w:sz w:val="16"/>
                 <w:szCs w:val="16"/>
               </w:rPr>
-              <w:t xml:space="preserve">Nuevo, a revisar</w:t>
+              <w:t xml:space="preserve">Actualizado el 23-10, a revisar</w:t>
             </w:r>
           </w:p>
         </w:tc>
@@ -1369,7 +1369,7 @@
                 <w:sz w:val="16"/>
                 <w:szCs w:val="16"/>
               </w:rPr>
-              <w:t xml:space="preserve">Nuevo, a revisar</w:t>
+              <w:t xml:space="preserve">Actualizado el 23-10, a revisar</w:t>
             </w:r>
           </w:p>
         </w:tc>
@@ -1785,7 +1785,7 @@
                 <w:sz w:val="16"/>
                 <w:szCs w:val="16"/>
               </w:rPr>
-              <w:t xml:space="preserve">Vigente; la evidencia de ejecución se agrega en cada Sprint Review</w:t>
+              <w:t xml:space="preserve">Vigente, con la exigencia de cobertura todavía sin activar; la evidencia de ejecución se agrega en cada Sprint Review</w:t>
             </w:r>
           </w:p>
         </w:tc>
@@ -1871,6 +1871,23 @@
         <w:t xml:space="preserve">Figura 1. Arquitectura de alto nivel y componentes (Pilar 2, figura 1).</w:t>
       </w:r>
     </w:p>
+    <w:p>
+      <w:pPr>
+        <w:keepNext w:val="false"/>
+        <w:spacing w:after="160" w:before="0" w:line="264" w:lineRule="auto"/>
+        <w:jc w:val="left"/>
+      </w:pPr>
+      <w:r>
+        <w:rPr>
+          <w:i/>
+          <w:iCs/>
+          <w:color w:val="595959"/>
+          <w:sz w:val="17"/>
+          <w:szCs w:val="17"/>
+        </w:rPr>
+        <w:t xml:space="preserve">La figura 1 es la del Pilar 2 y difiere de lo implementado en dos puntos. El cliente no es una SPA en React: son páginas HTML, CSS y JavaScript que el gateway sirve en /app/, la alternativa que AD-12 dejaba prevista si la base en React no estaba lista. Y el gateway no configura CORS, porque las páginas y la API salen del mismo origen (AD-13).</w:t>
+      </w:r>
+    </w:p>
     <w:tbl>
       <w:tblPr>
         <w:tblW w:type="dxa" w:w="9638"/>
@@ -2753,7 +2770,7 @@
                 <w:sz w:val="16"/>
                 <w:szCs w:val="16"/>
               </w:rPr>
-              <w:t xml:space="preserve">Valida la asignatura contra la malla y el nivel (RN-01) y trae los nombres de asignatura, carrera y sede que Tutorías copia.</w:t>
+              <w:t xml:space="preserve">Valida la asignatura contra la malla y el nivel (RN-01) y trae la sigla y el nombre de la asignatura, que Tutorías copia.</w:t>
             </w:r>
           </w:p>
         </w:tc>
@@ -2897,7 +2914,7 @@
                 <w:sz w:val="16"/>
                 <w:szCs w:val="16"/>
               </w:rPr>
-              <w:t xml:space="preserve">Consulta la reserva y avisa el resultado del pago.</w:t>
+              <w:t xml:space="preserve">Consulta la reserva y le informa cada estado del pago: PENDIENTE al crearlo (T-174) y después el resultado o el reembolso.</w:t>
             </w:r>
           </w:p>
         </w:tc>
@@ -2995,7 +3012,7 @@
           <w:sz w:val="17"/>
           <w:szCs w:val="17"/>
         </w:rPr>
-        <w:t xml:space="preserve">Las rutas /internal no las enruta el gateway: solo existen en la red interna y exigen una clave de servicio. Los tokens de usuario se firman con RS256; solo Identidad tiene la clave privada (AD-06).</w:t>
+        <w:t xml:space="preserve">Las rutas /internal no las enruta el gateway: responde 404 a cualquiera de ellas. Las cuatro llamadas internas llegan en los sprints 3 y 4: la 1 y la 2 con HU-14 y HU-21, la 3 con HU-23 y la 4 con la cancelación (HU-28). Quien llama envía la clave de servicio en la cabecera X-Clave-Servicio; sin la clave, o con otra, la ruta responde 404, como una ruta que no existe. Los tokens de usuario se firman con RS256 y solo Identidad tiene la clave privada (AD-06).</w:t>
       </w:r>
     </w:p>
     <w:p>
@@ -3016,7 +3033,7 @@
       <w:r>
         <w:drawing>
           <wp:inline distT="0" distB="0" distL="0" distR="0">
-            <wp:extent cx="6124575" cy="2714625"/>
+            <wp:extent cx="6032500" cy="2714625"/>
             <wp:effectExtent t="0" r="0" b="0" l="0"/>
             <wp:docPr id="1" name="despliegue.png" descr="Figura 2. Despliegue con Docker Compose: redes, contenedores y puertos publicados." title="Figura 2. Despliegue con Docker Compose: redes, contenedores y puertos publicados."/>
             <wp:cNvGraphicFramePr>
@@ -3041,7 +3058,7 @@
                   <pic:spPr bwMode="auto">
                     <a:xfrm>
                       <a:off x="0" y="0"/>
-                      <a:ext cx="6124575" cy="2714625"/>
+                      <a:ext cx="6032500" cy="2714625"/>
                     </a:xfrm>
                     <a:prstGeom prst="rect">
                       <a:avLst/>
@@ -3241,7 +3258,7 @@
                 <w:sz w:val="17"/>
                 <w:szCs w:val="17"/>
               </w:rPr>
-              <w:t xml:space="preserve"> desde la raíz del repositorio, con el .env copiado desde .env.example (README).</w:t>
+              <w:t xml:space="preserve"> desde la raíz del repositorio, con el .env copiado desde .env.example y las claves del token generadas la primera vez (README, «Probar la demo»).</w:t>
             </w:r>
           </w:p>
         </w:tc>
@@ -3313,7 +3330,7 @@
                 <w:sz w:val="17"/>
                 <w:szCs w:val="17"/>
               </w:rPr>
-              <w:t xml:space="preserve">Doce en total: gateway (Nginx), los cuatro servicios Django, sus cuatro bases PostgreSQL 16, Mailpit, el frontend React (HU-06) y el programador (HU-37). Hoy existen los diez primeros.</w:t>
+              <w:t xml:space="preserve">Once en total: gateway (Nginx), los cuatro servicios Django, sus cuatro bases PostgreSQL 16, Mailpit y el programador (HU-37). Hoy existen los diez primeros. No hay contenedor de frontend: el gateway sirve las páginas en /app/ (AD-12).</w:t>
             </w:r>
           </w:p>
         </w:tc>
@@ -3385,7 +3402,7 @@
                 <w:sz w:val="17"/>
                 <w:szCs w:val="17"/>
               </w:rPr>
-              <w:t xml:space="preserve">Solo el gateway publica un puerto (8080). La bandeja de Mailpit publica el 8025 únicamente en 127.0.0.1 y no es parte del sistema evaluado.</w:t>
+              <w:t xml:space="preserve">El gateway es el único componente del sistema que publica un puerto (8080, configurable con PUERTO_GATEWAY). La bandeja de Mailpit publica además el 8025, solo en 127.0.0.1, y no es parte del sistema evaluado.</w:t>
             </w:r>
           </w:p>
         </w:tc>
@@ -3777,7 +3794,7 @@
         <w:jc w:val="left"/>
       </w:pPr>
       <w:r>
-        <w:t xml:space="preserve">Cada servicio tiene su propia base PostgreSQL y ninguna clave foránea cruza de una base a otra (AD-08). El anexo A del Pilar 2 lleva las veinte tablas al nivel de la migración y es la fuente del esquema; los diagramas de cada base están en docs/diagramas del repositorio. El modelo implementado el 01-10 tiene 21 tablas y, como ningún servicio instala django.contrib.auth ni contenttypes, cada base suma solo la tabla django_migrations. La vista global muestra solo las entidades que participan de una frontera: la línea continua es una clave foránea real y la punteada, una referencia lógica que sostienen las llamadas internas.</w:t>
+        <w:t xml:space="preserve">Cada servicio tiene su propia base PostgreSQL y ninguna clave foránea cruza de una base a otra (AD-08). El anexo A del Pilar 2 lleva el modelo al nivel de la migración y es la fuente del esquema: su versión 1.5, del 23-10, tiene las 21 tablas del modelo implementado. Los diagramas de cada base están en docs/diagramas del repositorio. Como ningún servicio instala django.contrib.auth ni contenttypes, cada base suma solo la tabla django_migrations. La vista global muestra solo las entidades que participan de una frontera: la línea continua es una clave foránea real y la punteada, una referencia lógica que sostienen las llamadas internas.</w:t>
       </w:r>
     </w:p>
     <w:p>
@@ -3789,9 +3806,9 @@
       <w:r>
         <w:drawing>
           <wp:inline distT="0" distB="0" distL="0" distR="0">
-            <wp:extent cx="8503920" cy="3913346"/>
+            <wp:extent cx="8039107" cy="3913346"/>
             <wp:effectExtent t="0" r="0" b="0" l="0"/>
-            <wp:docPr id="1" name="vista_global.png" descr="Figura 4. Vista global del modelo implementado el 01-10 y de los datos que cruzan fronteras." title="Figura 4. Vista global del modelo implementado el 01-10 y de los datos que cruzan fronteras."/>
+            <wp:docPr id="1" name="vista_global.png" descr="Figura 4. Vista global del modelo implementado al 23-10 y de los datos que cruzan fronteras." title="Figura 4. Vista global del modelo implementado al 23-10 y de los datos que cruzan fronteras."/>
             <wp:cNvGraphicFramePr>
               <a:graphicFrameLocks xmlns:a="http://schemas.openxmlformats.org/drawingml/2006/main" noChangeAspect="1"/>
             </wp:cNvGraphicFramePr>
@@ -3814,7 +3831,7 @@
                   <pic:spPr bwMode="auto">
                     <a:xfrm>
                       <a:off x="0" y="0"/>
-                      <a:ext cx="8503920" cy="3913346"/>
+                      <a:ext cx="8039107" cy="3913346"/>
                     </a:xfrm>
                     <a:prstGeom prst="rect">
                       <a:avLst/>
@@ -3841,7 +3858,7 @@
           <w:sz w:val="17"/>
           <w:szCs w:val="17"/>
         </w:rPr>
-        <w:t xml:space="preserve">Figura 4. Vista global del modelo implementado el 01-10 y de los datos que cruzan fronteras.</w:t>
+        <w:t xml:space="preserve">Figura 4. Vista global del modelo implementado al 23-10 y de los datos que cruzan fronteras.</w:t>
       </w:r>
     </w:p>
     <w:p>
@@ -4435,7 +4452,7 @@
         <w:jc w:val="left"/>
       </w:pPr>
       <w:r>
-        <w:t xml:space="preserve">La revisión de normalización del 30-09 corrigió tres puntos del anexo A. En usuario_ref se quitaron carrera_nombre y sede_nombre, que dependían de carrera_id y sede_id y no de la clave (dependencia transitiva, 3FN). En reserva se quitó tutor_usuario_id, porque el tutor se deduce del bloque (3FN); por eso la regla de que nadie reserve su propio bloque (RN-03) pasó del CHECK ck_reserva_no_auto al disparador trg_reserva_no_auto, en la migración 0003. La columna errores jsonb de importacion_catalogo pasó a la tabla hija importacion_error, con la fila y el mensaje de cada error, porque una lista guardada en una celda no cumple la 1FN.</w:t>
+        <w:t xml:space="preserve">La revisión de normalización del 30-09 corrigió tres puntos del anexo A v1.4. En usuario_ref se quitaron carrera_nombre y sede_nombre, que dependían de carrera_id y sede_id y no de la clave (dependencia transitiva, 3FN). En reserva se quitó tutor_usuario_id, porque el tutor se deduce del bloque (3FN); por eso la regla de que nadie reserve su propio bloque (RN-03) pasó del CHECK ck_reserva_no_auto al disparador trg_reserva_no_auto, en la migración 0003 de Tutorías. La columna errores jsonb de importacion_catalogo pasó a la tabla hija importacion_error, con la fila y el mensaje de cada error, porque una lista guardada en una celda no cumple la 1FN.</w:t>
       </w:r>
     </w:p>
     <w:p>
@@ -4445,7 +4462,17 @@
         <w:jc w:val="left"/>
       </w:pPr>
       <w:r>
-        <w:t xml:space="preserve">La revisión también resolvió los puntos de su bloque B4. Los bloques de disponibilidad se borran de forma lógica, con estado ELIMINADO, y el EXCLUDE ignora los eliminados (T-169). La columna estado_pago de reserva queda en NULL al confirmar y pasa a PENDIENTE cuando Pagos crea el pago (T-174). Un bloque solo acepta PATCH si está LIBRE y sin solicitudes pendientes; si no, la API responde 409 (T-208). La fila de usuario_ref nace cuando la persona declara una asignatura, publica un bloque o solicita una tutoría (T-166). También se quitó el CHECK opcional de duración (T-167), la convención de marcas de tiempo se acotó a las filas que se editan (T-161) e importacion_catalogo quedó en la migración inicial (T-158), con SEDES entre los valores de tipo, como pide el criterio 2 de HU-07.</w:t>
+        <w:t xml:space="preserve">La misma revisión resolvió siete observaciones sobre el modelo. Un bloque de disponibilidad que ya recibió solicitudes no se borra: pasa a ELIMINADO, y el EXCLUDE ignora los eliminados, así que su horario queda libre para publicar otro (T-169); el que nunca recibió una se borra. La columna estado_pago de reserva queda en nulo al confirmar y pasa a PENDIENTE cuando Pagos crea el pago (T-174). Un bloque solo acepta PATCH si está LIBRE y sin solicitudes pendientes; si no, la API responde 409 (T-208). La fila de usuario_ref nace cuando la persona declara una asignatura, publica un bloque o solicita una tutoría (T-166). También se quitó el CHECK opcional de duración (T-167), la convención de marcas de tiempo se acotó a las filas que se editan (T-161) e importacion_catalogo quedó en la migración inicial (T-158), con SEDES entre los valores de tipo, como pide el criterio 2 de HU-07.</w:t>
+      </w:r>
+    </w:p>
+    <w:p>
+      <w:pPr>
+        <w:keepNext w:val="false"/>
+        <w:spacing w:after="120" w:before="0" w:line="264" w:lineRule="auto"/>
+        <w:jc w:val="left"/>
+      </w:pPr>
+      <w:r>
+        <w:t xml:space="preserve">Después, HU-12 agregó a asignatura la columna area (PR #9), con la que la API filtra la búsqueda por área (GET /asignaturas?area=). El anexo A v1.5 reúne todos estos cambios en su sección 3.1. Las reglas ON DELETE de las figuras 5 a 8 las aplica el ORM, no la base (anexo A, sección 2).</w:t>
       </w:r>
     </w:p>
     <w:p>
@@ -4469,9 +4496,9 @@
       <w:r>
         <w:drawing>
           <wp:inline distT="0" distB="0" distL="0" distR="0">
-            <wp:extent cx="8778240" cy="4083828"/>
+            <wp:extent cx="8773988" cy="4083828"/>
             <wp:effectExtent t="0" r="0" b="0" l="0"/>
-            <wp:docPr id="1001" name="01_identity_db.png" descr="Figura 5. Modelo implementado el 01-10: identity_db (4 tablas)." title="Figura 5. Modelo implementado el 01-10: identity_db (4 tablas)."/>
+            <wp:docPr id="1001" name="01_identity_db.png" descr="Figura 5. Modelo implementado al 23-10: identity_db (4 tablas)." title="Figura 5. Modelo implementado al 23-10: identity_db (4 tablas)."/>
             <wp:cNvGraphicFramePr>
               <a:graphicFrameLocks xmlns:a="http://schemas.openxmlformats.org/drawingml/2006/main" noChangeAspect="1"/>
             </wp:cNvGraphicFramePr>
@@ -4494,7 +4521,7 @@
                   <pic:spPr bwMode="auto">
                     <a:xfrm>
                       <a:off x="0" y="0"/>
-                      <a:ext cx="8778240" cy="4083828"/>
+                      <a:ext cx="8773988" cy="4083828"/>
                     </a:xfrm>
                     <a:prstGeom prst="rect">
                       <a:avLst/>
@@ -4521,7 +4548,7 @@
           <w:sz w:val="17"/>
           <w:szCs w:val="17"/>
         </w:rPr>
-        <w:t xml:space="preserve">Figura 5. Modelo implementado el 01-10: identity_db (4 tablas).</w:t>
+        <w:t xml:space="preserve">Figura 5. Modelo implementado al 23-10: identity_db (4 tablas).</w:t>
       </w:r>
     </w:p>
     <w:p>
@@ -4533,9 +4560,9 @@
       <w:r>
         <w:drawing>
           <wp:inline distT="0" distB="0" distL="0" distR="0">
-            <wp:extent cx="8580532" cy="5120640"/>
+            <wp:extent cx="8482676" cy="5120640"/>
             <wp:effectExtent t="0" r="0" b="0" l="0"/>
-            <wp:docPr id="1002" name="02_catalog_db.png" descr="Figura 6. Modelo implementado el 01-10: catalog_db (8 tablas, con importacion_error)." title="Figura 6. Modelo implementado el 01-10: catalog_db (8 tablas, con importacion_error)."/>
+            <wp:docPr id="1002" name="02_catalog_db.png" descr="Figura 6. Modelo implementado al 23-10: catalog_db (8 tablas, con importacion_error y la columna area)." title="Figura 6. Modelo implementado al 23-10: catalog_db (8 tablas, con importacion_error y la columna area)."/>
             <wp:cNvGraphicFramePr>
               <a:graphicFrameLocks xmlns:a="http://schemas.openxmlformats.org/drawingml/2006/main" noChangeAspect="1"/>
             </wp:cNvGraphicFramePr>
@@ -4558,7 +4585,7 @@
                   <pic:spPr bwMode="auto">
                     <a:xfrm>
                       <a:off x="0" y="0"/>
-                      <a:ext cx="8580532" cy="5120640"/>
+                      <a:ext cx="8482676" cy="5120640"/>
                     </a:xfrm>
                     <a:prstGeom prst="rect">
                       <a:avLst/>
@@ -4585,7 +4612,7 @@
           <w:sz w:val="17"/>
           <w:szCs w:val="17"/>
         </w:rPr>
-        <w:t xml:space="preserve">Figura 6. Modelo implementado el 01-10: catalog_db (8 tablas, con importacion_error).</w:t>
+        <w:t xml:space="preserve">Figura 6. Modelo implementado al 23-10: catalog_db (8 tablas, con importacion_error y la columna area).</w:t>
       </w:r>
     </w:p>
     <w:p>
@@ -4597,9 +4624,9 @@
       <w:r>
         <w:drawing>
           <wp:inline distT="0" distB="0" distL="0" distR="0">
-            <wp:extent cx="7298383" cy="5120640"/>
+            <wp:extent cx="7298383" cy="5110351"/>
             <wp:effectExtent t="0" r="0" b="0" l="0"/>
-            <wp:docPr id="1003" name="03_tutoring_db.png" descr="Figura 7. Modelo implementado el 01-10: tutoring_db (7 tablas)." title="Figura 7. Modelo implementado el 01-10: tutoring_db (7 tablas)."/>
+            <wp:docPr id="1003" name="03_tutoring_db.png" descr="Figura 7. Modelo implementado al 23-10: tutoring_db (7 tablas)." title="Figura 7. Modelo implementado al 23-10: tutoring_db (7 tablas)."/>
             <wp:cNvGraphicFramePr>
               <a:graphicFrameLocks xmlns:a="http://schemas.openxmlformats.org/drawingml/2006/main" noChangeAspect="1"/>
             </wp:cNvGraphicFramePr>
@@ -4622,7 +4649,7 @@
                   <pic:spPr bwMode="auto">
                     <a:xfrm>
                       <a:off x="0" y="0"/>
-                      <a:ext cx="7298383" cy="5120640"/>
+                      <a:ext cx="7298383" cy="5110351"/>
                     </a:xfrm>
                     <a:prstGeom prst="rect">
                       <a:avLst/>
@@ -4649,7 +4676,7 @@
           <w:sz w:val="17"/>
           <w:szCs w:val="17"/>
         </w:rPr>
-        <w:t xml:space="preserve">Figura 7. Modelo implementado el 01-10: tutoring_db (7 tablas).</w:t>
+        <w:t xml:space="preserve">Figura 7. Modelo implementado al 23-10: tutoring_db (7 tablas).</w:t>
       </w:r>
     </w:p>
     <w:p>
@@ -4661,9 +4688,9 @@
       <w:r>
         <w:drawing>
           <wp:inline distT="0" distB="0" distL="0" distR="0">
-            <wp:extent cx="5282284" cy="5120640"/>
+            <wp:extent cx="5282283" cy="5120640"/>
             <wp:effectExtent t="0" r="0" b="0" l="0"/>
-            <wp:docPr id="1004" name="04_payment_db.png" descr="Figura 8. Modelo implementado el 01-10: payment_db (2 tablas)." title="Figura 8. Modelo implementado el 01-10: payment_db (2 tablas)."/>
+            <wp:docPr id="1004" name="04_payment_db.png" descr="Figura 8. Modelo implementado al 23-10: payment_db (2 tablas)." title="Figura 8. Modelo implementado al 23-10: payment_db (2 tablas)."/>
             <wp:cNvGraphicFramePr>
               <a:graphicFrameLocks xmlns:a="http://schemas.openxmlformats.org/drawingml/2006/main" noChangeAspect="1"/>
             </wp:cNvGraphicFramePr>
@@ -4686,7 +4713,7 @@
                   <pic:spPr bwMode="auto">
                     <a:xfrm>
                       <a:off x="0" y="0"/>
-                      <a:ext cx="5282284" cy="5120640"/>
+                      <a:ext cx="5282283" cy="5120640"/>
                     </a:xfrm>
                     <a:prstGeom prst="rect">
                       <a:avLst/>
@@ -4713,7 +4740,7 @@
           <w:sz w:val="17"/>
           <w:szCs w:val="17"/>
         </w:rPr>
-        <w:t xml:space="preserve">Figura 8. Modelo implementado el 01-10: payment_db (2 tablas).</w:t>
+        <w:t xml:space="preserve">Figura 8. Modelo implementado al 23-10: payment_db (2 tablas).</w:t>
       </w:r>
     </w:p>
     <w:p>
@@ -5985,7 +6012,7 @@
         <w:jc w:val="left"/>
       </w:pPr>
       <w:r>
-        <w:t xml:space="preserve">Con Django, las clases del dominio son los modelos de cada servicio. El diagrama muestra el de Tutorías, que concentra las reglas de negocio. Los atributos salen del anexo A; las operaciones de Reserva corresponden a las transiciones de su sección 9, y sus nombres son una propuesta.</w:t>
+        <w:t xml:space="preserve">Con Django, las clases del dominio son los modelos de cada servicio. El diagrama muestra el de Tutorías, que concentra las reglas de negocio. Los atributos salen del modelo implementado (anexo A v1.5): UsuarioRef ya no copia los nombres de la carrera ni de la sede, y el tutor de una reserva es el dueño del bloque; las operaciones de Reserva corresponden a las transiciones de la sección 9 del anexo, y sus nombres son una propuesta.</w:t>
       </w:r>
     </w:p>
     <w:p>
@@ -5997,7 +6024,7 @@
       <w:r>
         <w:drawing>
           <wp:inline distT="0" distB="0" distL="0" distR="0">
-            <wp:extent cx="6124575" cy="3857625"/>
+            <wp:extent cx="5258580" cy="3857625"/>
             <wp:effectExtent t="0" r="0" b="0" l="0"/>
             <wp:docPr id="1" name="clases_tutorias.png" descr="Figura 10. Diagrama de clases del servicio de Tutorías." title="Figura 10. Diagrama de clases del servicio de Tutorías."/>
             <wp:cNvGraphicFramePr>
@@ -6022,7 +6049,7 @@
                   <pic:spPr bwMode="auto">
                     <a:xfrm>
                       <a:off x="0" y="0"/>
-                      <a:ext cx="6124575" cy="3857625"/>
+                      <a:ext cx="5258580" cy="3857625"/>
                     </a:xfrm>
                     <a:prstGeom prst="rect">
                       <a:avLst/>
@@ -6127,6 +6154,23 @@
     </w:p>
     <w:p>
       <w:pPr>
+        <w:keepNext w:val="false"/>
+        <w:spacing w:after="160" w:before="0" w:line="264" w:lineRule="auto"/>
+        <w:jc w:val="left"/>
+      </w:pPr>
+      <w:r>
+        <w:rPr>
+          <w:i/>
+          <w:iCs/>
+          <w:color w:val="595959"/>
+          <w:sz w:val="17"/>
+          <w:szCs w:val="17"/>
+        </w:rPr>
+        <w:t xml:space="preserve">Una solicitud también pasa a RECHAZADA si el tutor elimina el bloque, que queda ELIMINADO (anexo A, sección 9 y M-06).</w:t>
+      </w:r>
+    </w:p>
+    <w:p>
+      <w:pPr>
         <w:sectPr>
           <w:headerReference w:type="default" r:id="rId11"/>
           <w:footerReference w:type="default" r:id="rId12"/>
@@ -6153,7 +6197,7 @@
         <w:jc w:val="left"/>
       </w:pPr>
       <w:r>
-        <w:t xml:space="preserve">Tres secuencias cubren el recorrido principal: crear la cuenta y entrar (CA1), solicitar y confirmar una tutoría (CA3 y CA4), y pagar y reembolsar (CA5 y CA9). Muestran también las llamadas internas y la transacción que evita las dobles reservas.</w:t>
+        <w:t xml:space="preserve">Tres secuencias cubren el recorrido principal: crear la cuenta y entrar (CA1), solicitar y confirmar una tutoría (CA3 y CA4), y pagar y reembolsar (CA5 y CA9). Muestran también las llamadas internas y la transacción que evita las dobles reservas. La figura 12 muestra lo que ya está en develop; las figuras 13 y 14, el diseño de HU-21 a HU-24 y de la cancelación (HU-28), con los avisos por correo de HU-16.</w:t>
       </w:r>
     </w:p>
     <w:p>
@@ -6165,7 +6209,7 @@
       <w:r>
         <w:drawing>
           <wp:inline distT="0" distB="0" distL="0" distR="0">
-            <wp:extent cx="6629400" cy="4667250"/>
+            <wp:extent cx="6573092" cy="4667250"/>
             <wp:effectExtent t="0" r="0" b="0" l="0"/>
             <wp:docPr id="1" name="seq_registro.png" descr="Figura 12. Registro, verificación del correo e inicio de sesión." title="Figura 12. Registro, verificación del correo e inicio de sesión."/>
             <wp:cNvGraphicFramePr>
@@ -6190,7 +6234,7 @@
                   <pic:spPr bwMode="auto">
                     <a:xfrm>
                       <a:off x="0" y="0"/>
-                      <a:ext cx="6629400" cy="4667250"/>
+                      <a:ext cx="6573092" cy="4667250"/>
                     </a:xfrm>
                     <a:prstGeom prst="rect">
                       <a:avLst/>
@@ -6230,7 +6274,7 @@
       <w:r>
         <w:drawing>
           <wp:inline distT="0" distB="0" distL="0" distR="0">
-            <wp:extent cx="8839200" cy="5391150"/>
+            <wp:extent cx="8609258" cy="5391150"/>
             <wp:effectExtent t="0" r="0" b="0" l="0"/>
             <wp:docPr id="1" name="seq_reserva.png" descr="Figura 13. Solicitud y confirmación de una tutoría." title="Figura 13. Solicitud y confirmación de una tutoría."/>
             <wp:cNvGraphicFramePr>
@@ -6255,7 +6299,7 @@
                   <pic:spPr bwMode="auto">
                     <a:xfrm>
                       <a:off x="0" y="0"/>
-                      <a:ext cx="8839200" cy="5391150"/>
+                      <a:ext cx="8609258" cy="5391150"/>
                     </a:xfrm>
                     <a:prstGeom prst="rect">
                       <a:avLst/>
@@ -6295,7 +6339,7 @@
       <w:r>
         <w:drawing>
           <wp:inline distT="0" distB="0" distL="0" distR="0">
-            <wp:extent cx="7572375" cy="5391150"/>
+            <wp:extent cx="6365903" cy="5391150"/>
             <wp:effectExtent t="0" r="0" b="0" l="0"/>
             <wp:docPr id="1" name="seq_pago.png" descr="Figura 14. Pago simulado y reembolso al cancelar." title="Figura 14. Pago simulado y reembolso al cancelar."/>
             <wp:cNvGraphicFramePr>
@@ -6320,7 +6364,7 @@
                   <pic:spPr bwMode="auto">
                     <a:xfrm>
                       <a:off x="0" y="0"/>
-                      <a:ext cx="7572375" cy="5391150"/>
+                      <a:ext cx="6365903" cy="5391150"/>
                     </a:xfrm>
                     <a:prstGeom prst="rect">
                       <a:avLst/>
@@ -7351,7 +7395,7 @@
                 <w:sz w:val="16"/>
                 <w:szCs w:val="16"/>
               </w:rPr>
-              <w:t xml:space="preserve">HU-11, HU-27 y HU-36; la cobertura se publica en cada Pull Request.</w:t>
+              <w:t xml:space="preserve">HU-11, HU-27 y HU-36. La cobertura sale en el registro de cada Pull Request; la exigencia del 60 % todavía no está activada.</w:t>
             </w:r>
           </w:p>
         </w:tc>
@@ -7708,6 +7752,23 @@
         <w:t xml:space="preserve">Figura 15. Lo que ocurre en cada Pull Request (Pilar 5).</w:t>
       </w:r>
     </w:p>
+    <w:p>
+      <w:pPr>
+        <w:keepNext w:val="false"/>
+        <w:spacing w:after="160" w:before="0" w:line="264" w:lineRule="auto"/>
+        <w:jc w:val="left"/>
+      </w:pPr>
+      <w:r>
+        <w:rPr>
+          <w:i/>
+          <w:iCs/>
+          <w:color w:val="595959"/>
+          <w:sz w:val="17"/>
+          <w:szCs w:val="17"/>
+        </w:rPr>
+        <w:t xml:space="preserve">La figura 15 es la del Pilar 5. En ci.yml los cuatro trabajos corren en paralelo, y la regla de develop exige los siete checks en verde y una aprobación. ESLint, Prettier y Vitest corren solo si existe frontend/package.json; con las páginas de AD-12 esos pasos hoy no se ejecutan.</w:t>
+      </w:r>
+    </w:p>
     <w:tbl>
       <w:tblPr>
         <w:tblW w:type="dxa" w:w="9638"/>
@@ -8216,7 +8277,7 @@
                 <w:sz w:val="16"/>
                 <w:szCs w:val="16"/>
               </w:rPr>
-              <w:t xml:space="preserve">Comparación con el esquema de docs/api</w:t>
+              <w:t xml:space="preserve">Revisión del Pull Request contra docs/api (casilla de la plantilla del PR); la integración continua no lo automatiza</w:t>
             </w:r>
           </w:p>
         </w:tc>
@@ -8280,7 +8341,7 @@
                 <w:sz w:val="16"/>
                 <w:szCs w:val="16"/>
               </w:rPr>
-              <w:t xml:space="preserve">En cada Pull Request del servicio</w:t>
+              <w:t xml:space="preserve">En cada Pull Request que cambia una API pública. Catálogo todavía no tiene contrato en docs/api</w:t>
             </w:r>
           </w:p>
         </w:tc>
@@ -8488,7 +8549,7 @@
                 <w:sz w:val="16"/>
                 <w:szCs w:val="16"/>
               </w:rPr>
-              <w:t xml:space="preserve">Vitest y Testing Library</w:t>
+              <w:t xml:space="preserve">Navegador, con el recorrido escrito en «Cómo probarlo» del Pull Request</w:t>
             </w:r>
           </w:p>
         </w:tc>
@@ -8552,7 +8613,7 @@
                 <w:sz w:val="16"/>
                 <w:szCs w:val="16"/>
               </w:rPr>
-              <w:t xml:space="preserve">En cada Pull Request del frontend</w:t>
+              <w:t xml:space="preserve">En cada Pull Request que toca frontend/. El trabajo pruebas-frontend de la integración continua espera un proyecto de Node: hoy termina en verde sin ejecutar pruebas (AD-12)</w:t>
             </w:r>
           </w:p>
         </w:tc>
@@ -8707,7 +8768,7 @@
         <w:jc w:val="left"/>
       </w:pPr>
       <w:r>
-        <w:t xml:space="preserve">Las ramas de HU-04, HU-07, HU-08 y HU-23 traen pruebas de modelo con pytest: cada una intenta guardar algo que el anexo A prohíbe y comprueba que PostgreSQL lo rechaza sin pasar por el código de la aplicación. La rama de la demo, demo/semana-08, agrega un script de restricciones que hace veinte intentos sobre las bases levantadas. En la verificación del 30-09, hecha sobre un esquema equivalente en PostgreSQL 16, la base rechazó los diecinueve inválidos y aceptó el válido, que se incluyó a propósito: un bloque encima de otro eliminado.</w:t>
+        <w:t xml:space="preserve">Los PR de HU-04, HU-07, HU-08 y HU-23 (#5 a #8) incluyeron pruebas de modelo con pytest: cada una intenta guardar algo que el anexo A prohíbe y comprueba que PostgreSQL lo rechaza sin pasar por el código de la aplicación. El script scripts/probar_restricciones.ps1, que llegó a develop con el PR #16, hace veinte intentos sobre las bases levantadas. En la verificación del 30-09, hecha sobre un esquema equivalente en PostgreSQL 16, la base rechazó los diecinueve inválidos y aceptó el válido, que se incluyó a propósito: un bloque encima de otro eliminado.</w:t>
       </w:r>
     </w:p>
     <w:p>
@@ -8717,7 +8778,7 @@
         <w:jc w:val="left"/>
       </w:pPr>
       <w:r>
-        <w:t xml:space="preserve">El plan de pruebas de cada sprint está en su Sprint Planning (carpeta de cada sprint), y los resultados, en su Sprint Review. Así la evidencia de pruebas queda por sprint, como pide el instructivo.</w:t>
+        <w:t xml:space="preserve">El plan de pruebas de cada sprint está en su Sprint Planning (carpeta de cada sprint) y los resultados en su Sprint Review: la evidencia de pruebas queda por sprint, como pide el instructivo.</w:t>
       </w:r>
     </w:p>
     <w:sectPr>

</xml_diff>

<commit_message>
docs: README al 29-10, diagramas, anexo A v1.5 y documento 12 v1.1 (#25)
</commit_message>
<xml_diff>
--- a/Fase 2/Evidencias Proyecto/Evidencias de documentación/Listado de documentos/12_Evidencias_Tecnicas_de_Diseno.docx
+++ b/Fase 2/Evidencias Proyecto/Evidencias de documentación/Listado de documentos/12_Evidencias_Tecnicas_de_Diseno.docx
@@ -349,7 +349,7 @@
                 <w:sz w:val="17"/>
                 <w:szCs w:val="17"/>
               </w:rPr>
-              <w:t xml:space="preserve">1.0 · 27-09-2026 · secciones 3 y 6 actualizadas al 01-10-2026</w:t>
+              <w:t xml:space="preserve">1.1 · 23-10-2026. La 1.0 es del 27-09, con las secciones 3 y 6 al 01-10-2026</w:t>
             </w:r>
           </w:p>
         </w:tc>
@@ -421,7 +421,7 @@
                 <w:sz w:val="17"/>
                 <w:szCs w:val="17"/>
               </w:rPr>
-              <w:t xml:space="preserve">Vigente. Los diagramas de casos de uso, de clases, de secuencia y de despliegue son nuevos (27-09) y conviene que el equipo los revise.</w:t>
+              <w:t xml:space="preserve">Vigente. La versión 1.1 pone al día el estado de cada evidencia con develop al 23-10 y rehace las figuras 2, 4 a 8, 10 y 12 a 14 con el modelo implementado y la decisión AD-12. Conviene que el equipo revise los diagramas UML.</w:t>
             </w:r>
           </w:p>
         </w:tc>
@@ -493,7 +493,7 @@
                 <w:sz w:val="17"/>
                 <w:szCs w:val="17"/>
               </w:rPr>
-              <w:t xml:space="preserve">Pilar 2 v1.7 y su anexo A v1.4 · Pilar 1 v1.7 (RNF) · Pilar 5 v1.5 (pruebas e integración continua) · repositorio al 27-09 (docker-compose.yml, README y .github/workflows)</w:t>
+              <w:t xml:space="preserve">Pilar 2 v1.7 y su anexo A v1.5 · Pilar 1 v1.7 (RNF) · Pilar 5 v1.5 (pruebas e integración continua) · repositorio al 23-10, develop hasta el PR #18 (docker-compose.yml, README, .github/workflows y los modelos de cada servicio)</w:t>
             </w:r>
           </w:p>
         </w:tc>
@@ -641,7 +641,7 @@
                 <w:sz w:val="16"/>
                 <w:szCs w:val="16"/>
               </w:rPr>
-              <w:t xml:space="preserve">Estado al 27-09</w:t>
+              <w:t xml:space="preserve">Estado al 23-10</w:t>
             </w:r>
           </w:p>
         </w:tc>
@@ -849,7 +849,7 @@
                 <w:sz w:val="16"/>
                 <w:szCs w:val="16"/>
               </w:rPr>
-              <w:t xml:space="preserve">Vigente; los contratos OpenAPI se escriben al abrir cada sprint (docs/api, pendiente HU-03)</w:t>
+              <w:t xml:space="preserve">Diseño vigente; las llamadas internas llegan con HU-14, HU-21, HU-23 y HU-28. Contratos OpenAPI de Identidad y Tutorías en docs/api; faltan el de Catálogo y el de Pagos, que llega con HU-23</w:t>
             </w:r>
           </w:p>
         </w:tc>
@@ -953,7 +953,7 @@
                 <w:sz w:val="16"/>
                 <w:szCs w:val="16"/>
               </w:rPr>
-              <w:t xml:space="preserve">Vigente para 10 de los 12 contenedores; faltan frontend (HU-06) y programador (HU-37)</w:t>
+              <w:t xml:space="preserve">Vigente para 10 de los 11 contenedores; falta el programador (HU-37). Las páginas no llevan contenedor (AD-12)</w:t>
             </w:r>
           </w:p>
         </w:tc>
@@ -1057,7 +1057,7 @@
                 <w:sz w:val="16"/>
                 <w:szCs w:val="16"/>
               </w:rPr>
-              <w:t xml:space="preserve">Vigente (aprobado el 14-09)</w:t>
+              <w:t xml:space="preserve">Vigente: anexo A v1.5 (23-10), con el modelo implementado</w:t>
             </w:r>
           </w:p>
         </w:tc>
@@ -1161,7 +1161,7 @@
                 <w:sz w:val="16"/>
                 <w:szCs w:val="16"/>
               </w:rPr>
-              <w:t xml:space="preserve">Nuevo, a revisar</w:t>
+              <w:t xml:space="preserve">Del 27-09, a revisar</w:t>
             </w:r>
           </w:p>
         </w:tc>
@@ -1265,7 +1265,7 @@
                 <w:sz w:val="16"/>
                 <w:szCs w:val="16"/>
               </w:rPr>
-              <w:t xml:space="preserve">Nuevo, a revisar</w:t>
+              <w:t xml:space="preserve">Actualizado el 23-10, a revisar</w:t>
             </w:r>
           </w:p>
         </w:tc>
@@ -1369,7 +1369,7 @@
                 <w:sz w:val="16"/>
                 <w:szCs w:val="16"/>
               </w:rPr>
-              <w:t xml:space="preserve">Nuevo, a revisar</w:t>
+              <w:t xml:space="preserve">Actualizado el 23-10, a revisar</w:t>
             </w:r>
           </w:p>
         </w:tc>
@@ -1785,7 +1785,7 @@
                 <w:sz w:val="16"/>
                 <w:szCs w:val="16"/>
               </w:rPr>
-              <w:t xml:space="preserve">Vigente; la evidencia de ejecución se agrega en cada Sprint Review</w:t>
+              <w:t xml:space="preserve">Vigente, con la exigencia de cobertura todavía sin activar; la evidencia de ejecución se agrega en cada Sprint Review</w:t>
             </w:r>
           </w:p>
         </w:tc>
@@ -1871,6 +1871,23 @@
         <w:t xml:space="preserve">Figura 1. Arquitectura de alto nivel y componentes (Pilar 2, figura 1).</w:t>
       </w:r>
     </w:p>
+    <w:p>
+      <w:pPr>
+        <w:keepNext w:val="false"/>
+        <w:spacing w:after="160" w:before="0" w:line="264" w:lineRule="auto"/>
+        <w:jc w:val="left"/>
+      </w:pPr>
+      <w:r>
+        <w:rPr>
+          <w:i/>
+          <w:iCs/>
+          <w:color w:val="595959"/>
+          <w:sz w:val="17"/>
+          <w:szCs w:val="17"/>
+        </w:rPr>
+        <w:t xml:space="preserve">La figura 1 es la del Pilar 2 y difiere de lo implementado en dos puntos. El cliente no es una SPA en React: son páginas HTML, CSS y JavaScript que el gateway sirve en /app/, la alternativa que AD-12 dejaba prevista si la base en React no estaba lista. Y el gateway no configura CORS, porque las páginas y la API salen del mismo origen (AD-13).</w:t>
+      </w:r>
+    </w:p>
     <w:tbl>
       <w:tblPr>
         <w:tblW w:type="dxa" w:w="9638"/>
@@ -2753,7 +2770,7 @@
                 <w:sz w:val="16"/>
                 <w:szCs w:val="16"/>
               </w:rPr>
-              <w:t xml:space="preserve">Valida la asignatura contra la malla y el nivel (RN-01) y trae los nombres de asignatura, carrera y sede que Tutorías copia.</w:t>
+              <w:t xml:space="preserve">Valida la asignatura contra la malla y el nivel (RN-01) y trae la sigla y el nombre de la asignatura, que Tutorías copia.</w:t>
             </w:r>
           </w:p>
         </w:tc>
@@ -2897,7 +2914,7 @@
                 <w:sz w:val="16"/>
                 <w:szCs w:val="16"/>
               </w:rPr>
-              <w:t xml:space="preserve">Consulta la reserva y avisa el resultado del pago.</w:t>
+              <w:t xml:space="preserve">Consulta la reserva y le informa cada estado del pago: PENDIENTE al crearlo (T-174) y después el resultado o el reembolso.</w:t>
             </w:r>
           </w:p>
         </w:tc>
@@ -2995,7 +3012,7 @@
           <w:sz w:val="17"/>
           <w:szCs w:val="17"/>
         </w:rPr>
-        <w:t xml:space="preserve">Las rutas /internal no las enruta el gateway: solo existen en la red interna y exigen una clave de servicio. Los tokens de usuario se firman con RS256; solo Identidad tiene la clave privada (AD-06).</w:t>
+        <w:t xml:space="preserve">Las rutas /internal no las enruta el gateway: responde 404 a cualquiera de ellas. Las cuatro llamadas internas llegan en los sprints 3 y 4: la 1 y la 2 con HU-14 y HU-21, la 3 con HU-23 y la 4 con la cancelación (HU-28). Quien llama envía la clave de servicio en la cabecera X-Clave-Servicio; sin la clave, o con otra, la ruta responde 404, como una ruta que no existe. Los tokens de usuario se firman con RS256 y solo Identidad tiene la clave privada (AD-06).</w:t>
       </w:r>
     </w:p>
     <w:p>
@@ -3016,7 +3033,7 @@
       <w:r>
         <w:drawing>
           <wp:inline distT="0" distB="0" distL="0" distR="0">
-            <wp:extent cx="6124575" cy="2714625"/>
+            <wp:extent cx="6032500" cy="2714625"/>
             <wp:effectExtent t="0" r="0" b="0" l="0"/>
             <wp:docPr id="1" name="despliegue.png" descr="Figura 2. Despliegue con Docker Compose: redes, contenedores y puertos publicados." title="Figura 2. Despliegue con Docker Compose: redes, contenedores y puertos publicados."/>
             <wp:cNvGraphicFramePr>
@@ -3041,7 +3058,7 @@
                   <pic:spPr bwMode="auto">
                     <a:xfrm>
                       <a:off x="0" y="0"/>
-                      <a:ext cx="6124575" cy="2714625"/>
+                      <a:ext cx="6032500" cy="2714625"/>
                     </a:xfrm>
                     <a:prstGeom prst="rect">
                       <a:avLst/>
@@ -3241,7 +3258,7 @@
                 <w:sz w:val="17"/>
                 <w:szCs w:val="17"/>
               </w:rPr>
-              <w:t xml:space="preserve"> desde la raíz del repositorio, con el .env copiado desde .env.example (README).</w:t>
+              <w:t xml:space="preserve"> desde la raíz del repositorio, con el .env copiado desde .env.example y las claves del token generadas la primera vez (README, «Probar la demo»).</w:t>
             </w:r>
           </w:p>
         </w:tc>
@@ -3313,7 +3330,7 @@
                 <w:sz w:val="17"/>
                 <w:szCs w:val="17"/>
               </w:rPr>
-              <w:t xml:space="preserve">Doce en total: gateway (Nginx), los cuatro servicios Django, sus cuatro bases PostgreSQL 16, Mailpit, el frontend React (HU-06) y el programador (HU-37). Hoy existen los diez primeros.</w:t>
+              <w:t xml:space="preserve">Once en total: gateway (Nginx), los cuatro servicios Django, sus cuatro bases PostgreSQL 16, Mailpit y el programador (HU-37). Hoy existen los diez primeros. No hay contenedor de frontend: el gateway sirve las páginas en /app/ (AD-12).</w:t>
             </w:r>
           </w:p>
         </w:tc>
@@ -3385,7 +3402,7 @@
                 <w:sz w:val="17"/>
                 <w:szCs w:val="17"/>
               </w:rPr>
-              <w:t xml:space="preserve">Solo el gateway publica un puerto (8080). La bandeja de Mailpit publica el 8025 únicamente en 127.0.0.1 y no es parte del sistema evaluado.</w:t>
+              <w:t xml:space="preserve">El gateway es el único componente del sistema que publica un puerto (8080, configurable con PUERTO_GATEWAY). La bandeja de Mailpit publica además el 8025, solo en 127.0.0.1, y no es parte del sistema evaluado.</w:t>
             </w:r>
           </w:p>
         </w:tc>
@@ -3777,7 +3794,7 @@
         <w:jc w:val="left"/>
       </w:pPr>
       <w:r>
-        <w:t xml:space="preserve">Cada servicio tiene su propia base PostgreSQL y ninguna clave foránea cruza de una base a otra (AD-08). El anexo A del Pilar 2 lleva las veinte tablas al nivel de la migración y es la fuente del esquema; los diagramas de cada base están en docs/diagramas del repositorio. El modelo implementado el 01-10 tiene 21 tablas y, como ningún servicio instala django.contrib.auth ni contenttypes, cada base suma solo la tabla django_migrations. La vista global muestra solo las entidades que participan de una frontera: la línea continua es una clave foránea real y la punteada, una referencia lógica que sostienen las llamadas internas.</w:t>
+        <w:t xml:space="preserve">Cada servicio tiene su propia base PostgreSQL y ninguna clave foránea cruza de una base a otra (AD-08). El anexo A del Pilar 2 lleva el modelo al nivel de la migración y es la fuente del esquema: su versión 1.5, del 23-10, tiene las 21 tablas del modelo implementado. Los diagramas de cada base están en docs/diagramas del repositorio. Como ningún servicio instala django.contrib.auth ni contenttypes, cada base suma solo la tabla django_migrations. La vista global muestra solo las entidades que participan de una frontera: la línea continua es una clave foránea real y la punteada, una referencia lógica que sostienen las llamadas internas.</w:t>
       </w:r>
     </w:p>
     <w:p>
@@ -3789,9 +3806,9 @@
       <w:r>
         <w:drawing>
           <wp:inline distT="0" distB="0" distL="0" distR="0">
-            <wp:extent cx="8503920" cy="3913346"/>
+            <wp:extent cx="8039107" cy="3913346"/>
             <wp:effectExtent t="0" r="0" b="0" l="0"/>
-            <wp:docPr id="1" name="vista_global.png" descr="Figura 4. Vista global del modelo implementado el 01-10 y de los datos que cruzan fronteras." title="Figura 4. Vista global del modelo implementado el 01-10 y de los datos que cruzan fronteras."/>
+            <wp:docPr id="1" name="vista_global.png" descr="Figura 4. Vista global del modelo implementado al 23-10 y de los datos que cruzan fronteras." title="Figura 4. Vista global del modelo implementado al 23-10 y de los datos que cruzan fronteras."/>
             <wp:cNvGraphicFramePr>
               <a:graphicFrameLocks xmlns:a="http://schemas.openxmlformats.org/drawingml/2006/main" noChangeAspect="1"/>
             </wp:cNvGraphicFramePr>
@@ -3814,7 +3831,7 @@
                   <pic:spPr bwMode="auto">
                     <a:xfrm>
                       <a:off x="0" y="0"/>
-                      <a:ext cx="8503920" cy="3913346"/>
+                      <a:ext cx="8039107" cy="3913346"/>
                     </a:xfrm>
                     <a:prstGeom prst="rect">
                       <a:avLst/>
@@ -3841,7 +3858,7 @@
           <w:sz w:val="17"/>
           <w:szCs w:val="17"/>
         </w:rPr>
-        <w:t xml:space="preserve">Figura 4. Vista global del modelo implementado el 01-10 y de los datos que cruzan fronteras.</w:t>
+        <w:t xml:space="preserve">Figura 4. Vista global del modelo implementado al 23-10 y de los datos que cruzan fronteras.</w:t>
       </w:r>
     </w:p>
     <w:p>
@@ -4435,7 +4452,7 @@
         <w:jc w:val="left"/>
       </w:pPr>
       <w:r>
-        <w:t xml:space="preserve">La revisión de normalización del 30-09 corrigió tres puntos del anexo A. En usuario_ref se quitaron carrera_nombre y sede_nombre, que dependían de carrera_id y sede_id y no de la clave (dependencia transitiva, 3FN). En reserva se quitó tutor_usuario_id, porque el tutor se deduce del bloque (3FN); por eso la regla de que nadie reserve su propio bloque (RN-03) pasó del CHECK ck_reserva_no_auto al disparador trg_reserva_no_auto, en la migración 0003. La columna errores jsonb de importacion_catalogo pasó a la tabla hija importacion_error, con la fila y el mensaje de cada error, porque una lista guardada en una celda no cumple la 1FN.</w:t>
+        <w:t xml:space="preserve">La revisión de normalización del 30-09 corrigió tres puntos del anexo A v1.4. En usuario_ref se quitaron carrera_nombre y sede_nombre, que dependían de carrera_id y sede_id y no de la clave (dependencia transitiva, 3FN). En reserva se quitó tutor_usuario_id, porque el tutor se deduce del bloque (3FN); por eso la regla de que nadie reserve su propio bloque (RN-03) pasó del CHECK ck_reserva_no_auto al disparador trg_reserva_no_auto, en la migración 0003 de Tutorías. La columna errores jsonb de importacion_catalogo pasó a la tabla hija importacion_error, con la fila y el mensaje de cada error, porque una lista guardada en una celda no cumple la 1FN.</w:t>
       </w:r>
     </w:p>
     <w:p>
@@ -4445,7 +4462,17 @@
         <w:jc w:val="left"/>
       </w:pPr>
       <w:r>
-        <w:t xml:space="preserve">La revisión también resolvió los puntos de su bloque B4. Los bloques de disponibilidad se borran de forma lógica, con estado ELIMINADO, y el EXCLUDE ignora los eliminados (T-169). La columna estado_pago de reserva queda en NULL al confirmar y pasa a PENDIENTE cuando Pagos crea el pago (T-174). Un bloque solo acepta PATCH si está LIBRE y sin solicitudes pendientes; si no, la API responde 409 (T-208). La fila de usuario_ref nace cuando la persona declara una asignatura, publica un bloque o solicita una tutoría (T-166). También se quitó el CHECK opcional de duración (T-167), la convención de marcas de tiempo se acotó a las filas que se editan (T-161) e importacion_catalogo quedó en la migración inicial (T-158), con SEDES entre los valores de tipo, como pide el criterio 2 de HU-07.</w:t>
+        <w:t xml:space="preserve">La misma revisión resolvió siete observaciones sobre el modelo. Un bloque de disponibilidad que ya recibió solicitudes no se borra: pasa a ELIMINADO, y el EXCLUDE ignora los eliminados, así que su horario queda libre para publicar otro (T-169); el que nunca recibió una se borra. La columna estado_pago de reserva queda en nulo al confirmar y pasa a PENDIENTE cuando Pagos crea el pago (T-174). Un bloque solo acepta PATCH si está LIBRE y sin solicitudes pendientes; si no, la API responde 409 (T-208). La fila de usuario_ref nace cuando la persona declara una asignatura, publica un bloque o solicita una tutoría (T-166). También se quitó el CHECK opcional de duración (T-167), la convención de marcas de tiempo se acotó a las filas que se editan (T-161) e importacion_catalogo quedó en la migración inicial (T-158), con SEDES entre los valores de tipo, como pide el criterio 2 de HU-07.</w:t>
+      </w:r>
+    </w:p>
+    <w:p>
+      <w:pPr>
+        <w:keepNext w:val="false"/>
+        <w:spacing w:after="120" w:before="0" w:line="264" w:lineRule="auto"/>
+        <w:jc w:val="left"/>
+      </w:pPr>
+      <w:r>
+        <w:t xml:space="preserve">Después, HU-12 agregó a asignatura la columna area (PR #9), con la que la API filtra la búsqueda por área (GET /asignaturas?area=). El anexo A v1.5 reúne todos estos cambios en su sección 3.1. Las reglas ON DELETE de las figuras 5 a 8 las aplica el ORM, no la base (anexo A, sección 2).</w:t>
       </w:r>
     </w:p>
     <w:p>
@@ -4469,9 +4496,9 @@
       <w:r>
         <w:drawing>
           <wp:inline distT="0" distB="0" distL="0" distR="0">
-            <wp:extent cx="8778240" cy="4083828"/>
+            <wp:extent cx="8773988" cy="4083828"/>
             <wp:effectExtent t="0" r="0" b="0" l="0"/>
-            <wp:docPr id="1001" name="01_identity_db.png" descr="Figura 5. Modelo implementado el 01-10: identity_db (4 tablas)." title="Figura 5. Modelo implementado el 01-10: identity_db (4 tablas)."/>
+            <wp:docPr id="1001" name="01_identity_db.png" descr="Figura 5. Modelo implementado al 23-10: identity_db (4 tablas)." title="Figura 5. Modelo implementado al 23-10: identity_db (4 tablas)."/>
             <wp:cNvGraphicFramePr>
               <a:graphicFrameLocks xmlns:a="http://schemas.openxmlformats.org/drawingml/2006/main" noChangeAspect="1"/>
             </wp:cNvGraphicFramePr>
@@ -4494,7 +4521,7 @@
                   <pic:spPr bwMode="auto">
                     <a:xfrm>
                       <a:off x="0" y="0"/>
-                      <a:ext cx="8778240" cy="4083828"/>
+                      <a:ext cx="8773988" cy="4083828"/>
                     </a:xfrm>
                     <a:prstGeom prst="rect">
                       <a:avLst/>
@@ -4521,7 +4548,7 @@
           <w:sz w:val="17"/>
           <w:szCs w:val="17"/>
         </w:rPr>
-        <w:t xml:space="preserve">Figura 5. Modelo implementado el 01-10: identity_db (4 tablas).</w:t>
+        <w:t xml:space="preserve">Figura 5. Modelo implementado al 23-10: identity_db (4 tablas).</w:t>
       </w:r>
     </w:p>
     <w:p>
@@ -4533,9 +4560,9 @@
       <w:r>
         <w:drawing>
           <wp:inline distT="0" distB="0" distL="0" distR="0">
-            <wp:extent cx="8580532" cy="5120640"/>
+            <wp:extent cx="8482676" cy="5120640"/>
             <wp:effectExtent t="0" r="0" b="0" l="0"/>
-            <wp:docPr id="1002" name="02_catalog_db.png" descr="Figura 6. Modelo implementado el 01-10: catalog_db (8 tablas, con importacion_error)." title="Figura 6. Modelo implementado el 01-10: catalog_db (8 tablas, con importacion_error)."/>
+            <wp:docPr id="1002" name="02_catalog_db.png" descr="Figura 6. Modelo implementado al 23-10: catalog_db (8 tablas, con importacion_error y la columna area)." title="Figura 6. Modelo implementado al 23-10: catalog_db (8 tablas, con importacion_error y la columna area)."/>
             <wp:cNvGraphicFramePr>
               <a:graphicFrameLocks xmlns:a="http://schemas.openxmlformats.org/drawingml/2006/main" noChangeAspect="1"/>
             </wp:cNvGraphicFramePr>
@@ -4558,7 +4585,7 @@
                   <pic:spPr bwMode="auto">
                     <a:xfrm>
                       <a:off x="0" y="0"/>
-                      <a:ext cx="8580532" cy="5120640"/>
+                      <a:ext cx="8482676" cy="5120640"/>
                     </a:xfrm>
                     <a:prstGeom prst="rect">
                       <a:avLst/>
@@ -4585,7 +4612,7 @@
           <w:sz w:val="17"/>
           <w:szCs w:val="17"/>
         </w:rPr>
-        <w:t xml:space="preserve">Figura 6. Modelo implementado el 01-10: catalog_db (8 tablas, con importacion_error).</w:t>
+        <w:t xml:space="preserve">Figura 6. Modelo implementado al 23-10: catalog_db (8 tablas, con importacion_error y la columna area).</w:t>
       </w:r>
     </w:p>
     <w:p>
@@ -4597,9 +4624,9 @@
       <w:r>
         <w:drawing>
           <wp:inline distT="0" distB="0" distL="0" distR="0">
-            <wp:extent cx="7298383" cy="5120640"/>
+            <wp:extent cx="7298383" cy="5110351"/>
             <wp:effectExtent t="0" r="0" b="0" l="0"/>
-            <wp:docPr id="1003" name="03_tutoring_db.png" descr="Figura 7. Modelo implementado el 01-10: tutoring_db (7 tablas)." title="Figura 7. Modelo implementado el 01-10: tutoring_db (7 tablas)."/>
+            <wp:docPr id="1003" name="03_tutoring_db.png" descr="Figura 7. Modelo implementado al 23-10: tutoring_db (7 tablas)." title="Figura 7. Modelo implementado al 23-10: tutoring_db (7 tablas)."/>
             <wp:cNvGraphicFramePr>
               <a:graphicFrameLocks xmlns:a="http://schemas.openxmlformats.org/drawingml/2006/main" noChangeAspect="1"/>
             </wp:cNvGraphicFramePr>
@@ -4622,7 +4649,7 @@
                   <pic:spPr bwMode="auto">
                     <a:xfrm>
                       <a:off x="0" y="0"/>
-                      <a:ext cx="7298383" cy="5120640"/>
+                      <a:ext cx="7298383" cy="5110351"/>
                     </a:xfrm>
                     <a:prstGeom prst="rect">
                       <a:avLst/>
@@ -4649,7 +4676,7 @@
           <w:sz w:val="17"/>
           <w:szCs w:val="17"/>
         </w:rPr>
-        <w:t xml:space="preserve">Figura 7. Modelo implementado el 01-10: tutoring_db (7 tablas).</w:t>
+        <w:t xml:space="preserve">Figura 7. Modelo implementado al 23-10: tutoring_db (7 tablas).</w:t>
       </w:r>
     </w:p>
     <w:p>
@@ -4661,9 +4688,9 @@
       <w:r>
         <w:drawing>
           <wp:inline distT="0" distB="0" distL="0" distR="0">
-            <wp:extent cx="5282284" cy="5120640"/>
+            <wp:extent cx="5282283" cy="5120640"/>
             <wp:effectExtent t="0" r="0" b="0" l="0"/>
-            <wp:docPr id="1004" name="04_payment_db.png" descr="Figura 8. Modelo implementado el 01-10: payment_db (2 tablas)." title="Figura 8. Modelo implementado el 01-10: payment_db (2 tablas)."/>
+            <wp:docPr id="1004" name="04_payment_db.png" descr="Figura 8. Modelo implementado al 23-10: payment_db (2 tablas)." title="Figura 8. Modelo implementado al 23-10: payment_db (2 tablas)."/>
             <wp:cNvGraphicFramePr>
               <a:graphicFrameLocks xmlns:a="http://schemas.openxmlformats.org/drawingml/2006/main" noChangeAspect="1"/>
             </wp:cNvGraphicFramePr>
@@ -4686,7 +4713,7 @@
                   <pic:spPr bwMode="auto">
                     <a:xfrm>
                       <a:off x="0" y="0"/>
-                      <a:ext cx="5282284" cy="5120640"/>
+                      <a:ext cx="5282283" cy="5120640"/>
                     </a:xfrm>
                     <a:prstGeom prst="rect">
                       <a:avLst/>
@@ -4713,7 +4740,7 @@
           <w:sz w:val="17"/>
           <w:szCs w:val="17"/>
         </w:rPr>
-        <w:t xml:space="preserve">Figura 8. Modelo implementado el 01-10: payment_db (2 tablas).</w:t>
+        <w:t xml:space="preserve">Figura 8. Modelo implementado al 23-10: payment_db (2 tablas).</w:t>
       </w:r>
     </w:p>
     <w:p>
@@ -5985,7 +6012,7 @@
         <w:jc w:val="left"/>
       </w:pPr>
       <w:r>
-        <w:t xml:space="preserve">Con Django, las clases del dominio son los modelos de cada servicio. El diagrama muestra el de Tutorías, que concentra las reglas de negocio. Los atributos salen del anexo A; las operaciones de Reserva corresponden a las transiciones de su sección 9, y sus nombres son una propuesta.</w:t>
+        <w:t xml:space="preserve">Con Django, las clases del dominio son los modelos de cada servicio. El diagrama muestra el de Tutorías, que concentra las reglas de negocio. Los atributos salen del modelo implementado (anexo A v1.5): UsuarioRef ya no copia los nombres de la carrera ni de la sede, y el tutor de una reserva es el dueño del bloque; las operaciones de Reserva corresponden a las transiciones de la sección 9 del anexo, y sus nombres son una propuesta.</w:t>
       </w:r>
     </w:p>
     <w:p>
@@ -5997,7 +6024,7 @@
       <w:r>
         <w:drawing>
           <wp:inline distT="0" distB="0" distL="0" distR="0">
-            <wp:extent cx="6124575" cy="3857625"/>
+            <wp:extent cx="5258580" cy="3857625"/>
             <wp:effectExtent t="0" r="0" b="0" l="0"/>
             <wp:docPr id="1" name="clases_tutorias.png" descr="Figura 10. Diagrama de clases del servicio de Tutorías." title="Figura 10. Diagrama de clases del servicio de Tutorías."/>
             <wp:cNvGraphicFramePr>
@@ -6022,7 +6049,7 @@
                   <pic:spPr bwMode="auto">
                     <a:xfrm>
                       <a:off x="0" y="0"/>
-                      <a:ext cx="6124575" cy="3857625"/>
+                      <a:ext cx="5258580" cy="3857625"/>
                     </a:xfrm>
                     <a:prstGeom prst="rect">
                       <a:avLst/>
@@ -6127,6 +6154,23 @@
     </w:p>
     <w:p>
       <w:pPr>
+        <w:keepNext w:val="false"/>
+        <w:spacing w:after="160" w:before="0" w:line="264" w:lineRule="auto"/>
+        <w:jc w:val="left"/>
+      </w:pPr>
+      <w:r>
+        <w:rPr>
+          <w:i/>
+          <w:iCs/>
+          <w:color w:val="595959"/>
+          <w:sz w:val="17"/>
+          <w:szCs w:val="17"/>
+        </w:rPr>
+        <w:t xml:space="preserve">Una solicitud también pasa a RECHAZADA si el tutor elimina el bloque, que queda ELIMINADO (anexo A, sección 9 y M-06).</w:t>
+      </w:r>
+    </w:p>
+    <w:p>
+      <w:pPr>
         <w:sectPr>
           <w:headerReference w:type="default" r:id="rId11"/>
           <w:footerReference w:type="default" r:id="rId12"/>
@@ -6153,7 +6197,7 @@
         <w:jc w:val="left"/>
       </w:pPr>
       <w:r>
-        <w:t xml:space="preserve">Tres secuencias cubren el recorrido principal: crear la cuenta y entrar (CA1), solicitar y confirmar una tutoría (CA3 y CA4), y pagar y reembolsar (CA5 y CA9). Muestran también las llamadas internas y la transacción que evita las dobles reservas.</w:t>
+        <w:t xml:space="preserve">Tres secuencias cubren el recorrido principal: crear la cuenta y entrar (CA1), solicitar y confirmar una tutoría (CA3 y CA4), y pagar y reembolsar (CA5 y CA9). Muestran también las llamadas internas y la transacción que evita las dobles reservas. La figura 12 muestra lo que ya está en develop; las figuras 13 y 14, el diseño de HU-21 a HU-24 y de la cancelación (HU-28), con los avisos por correo de HU-16.</w:t>
       </w:r>
     </w:p>
     <w:p>
@@ -6165,7 +6209,7 @@
       <w:r>
         <w:drawing>
           <wp:inline distT="0" distB="0" distL="0" distR="0">
-            <wp:extent cx="6629400" cy="4667250"/>
+            <wp:extent cx="6573092" cy="4667250"/>
             <wp:effectExtent t="0" r="0" b="0" l="0"/>
             <wp:docPr id="1" name="seq_registro.png" descr="Figura 12. Registro, verificación del correo e inicio de sesión." title="Figura 12. Registro, verificación del correo e inicio de sesión."/>
             <wp:cNvGraphicFramePr>
@@ -6190,7 +6234,7 @@
                   <pic:spPr bwMode="auto">
                     <a:xfrm>
                       <a:off x="0" y="0"/>
-                      <a:ext cx="6629400" cy="4667250"/>
+                      <a:ext cx="6573092" cy="4667250"/>
                     </a:xfrm>
                     <a:prstGeom prst="rect">
                       <a:avLst/>
@@ -6230,7 +6274,7 @@
       <w:r>
         <w:drawing>
           <wp:inline distT="0" distB="0" distL="0" distR="0">
-            <wp:extent cx="8839200" cy="5391150"/>
+            <wp:extent cx="8609258" cy="5391150"/>
             <wp:effectExtent t="0" r="0" b="0" l="0"/>
             <wp:docPr id="1" name="seq_reserva.png" descr="Figura 13. Solicitud y confirmación de una tutoría." title="Figura 13. Solicitud y confirmación de una tutoría."/>
             <wp:cNvGraphicFramePr>
@@ -6255,7 +6299,7 @@
                   <pic:spPr bwMode="auto">
                     <a:xfrm>
                       <a:off x="0" y="0"/>
-                      <a:ext cx="8839200" cy="5391150"/>
+                      <a:ext cx="8609258" cy="5391150"/>
                     </a:xfrm>
                     <a:prstGeom prst="rect">
                       <a:avLst/>
@@ -6295,7 +6339,7 @@
       <w:r>
         <w:drawing>
           <wp:inline distT="0" distB="0" distL="0" distR="0">
-            <wp:extent cx="7572375" cy="5391150"/>
+            <wp:extent cx="6365903" cy="5391150"/>
             <wp:effectExtent t="0" r="0" b="0" l="0"/>
             <wp:docPr id="1" name="seq_pago.png" descr="Figura 14. Pago simulado y reembolso al cancelar." title="Figura 14. Pago simulado y reembolso al cancelar."/>
             <wp:cNvGraphicFramePr>
@@ -6320,7 +6364,7 @@
                   <pic:spPr bwMode="auto">
                     <a:xfrm>
                       <a:off x="0" y="0"/>
-                      <a:ext cx="7572375" cy="5391150"/>
+                      <a:ext cx="6365903" cy="5391150"/>
                     </a:xfrm>
                     <a:prstGeom prst="rect">
                       <a:avLst/>
@@ -7351,7 +7395,7 @@
                 <w:sz w:val="16"/>
                 <w:szCs w:val="16"/>
               </w:rPr>
-              <w:t xml:space="preserve">HU-11, HU-27 y HU-36; la cobertura se publica en cada Pull Request.</w:t>
+              <w:t xml:space="preserve">HU-11, HU-27 y HU-36. La cobertura sale en el registro de cada Pull Request; la exigencia del 60 % todavía no está activada.</w:t>
             </w:r>
           </w:p>
         </w:tc>
@@ -7708,6 +7752,23 @@
         <w:t xml:space="preserve">Figura 15. Lo que ocurre en cada Pull Request (Pilar 5).</w:t>
       </w:r>
     </w:p>
+    <w:p>
+      <w:pPr>
+        <w:keepNext w:val="false"/>
+        <w:spacing w:after="160" w:before="0" w:line="264" w:lineRule="auto"/>
+        <w:jc w:val="left"/>
+      </w:pPr>
+      <w:r>
+        <w:rPr>
+          <w:i/>
+          <w:iCs/>
+          <w:color w:val="595959"/>
+          <w:sz w:val="17"/>
+          <w:szCs w:val="17"/>
+        </w:rPr>
+        <w:t xml:space="preserve">La figura 15 es la del Pilar 5. En ci.yml los cuatro trabajos corren en paralelo, y la regla de develop exige los siete checks en verde y una aprobación. ESLint, Prettier y Vitest corren solo si existe frontend/package.json; con las páginas de AD-12 esos pasos hoy no se ejecutan.</w:t>
+      </w:r>
+    </w:p>
     <w:tbl>
       <w:tblPr>
         <w:tblW w:type="dxa" w:w="9638"/>
@@ -8216,7 +8277,7 @@
                 <w:sz w:val="16"/>
                 <w:szCs w:val="16"/>
               </w:rPr>
-              <w:t xml:space="preserve">Comparación con el esquema de docs/api</w:t>
+              <w:t xml:space="preserve">Revisión del Pull Request contra docs/api (casilla de la plantilla del PR); la integración continua no lo automatiza</w:t>
             </w:r>
           </w:p>
         </w:tc>
@@ -8280,7 +8341,7 @@
                 <w:sz w:val="16"/>
                 <w:szCs w:val="16"/>
               </w:rPr>
-              <w:t xml:space="preserve">En cada Pull Request del servicio</w:t>
+              <w:t xml:space="preserve">En cada Pull Request que cambia una API pública. Catálogo todavía no tiene contrato en docs/api</w:t>
             </w:r>
           </w:p>
         </w:tc>
@@ -8488,7 +8549,7 @@
                 <w:sz w:val="16"/>
                 <w:szCs w:val="16"/>
               </w:rPr>
-              <w:t xml:space="preserve">Vitest y Testing Library</w:t>
+              <w:t xml:space="preserve">Navegador, con el recorrido escrito en «Cómo probarlo» del Pull Request</w:t>
             </w:r>
           </w:p>
         </w:tc>
@@ -8552,7 +8613,7 @@
                 <w:sz w:val="16"/>
                 <w:szCs w:val="16"/>
               </w:rPr>
-              <w:t xml:space="preserve">En cada Pull Request del frontend</w:t>
+              <w:t xml:space="preserve">En cada Pull Request que toca frontend/. El trabajo pruebas-frontend de la integración continua espera un proyecto de Node: hoy termina en verde sin ejecutar pruebas (AD-12)</w:t>
             </w:r>
           </w:p>
         </w:tc>
@@ -8707,7 +8768,7 @@
         <w:jc w:val="left"/>
       </w:pPr>
       <w:r>
-        <w:t xml:space="preserve">Las ramas de HU-04, HU-07, HU-08 y HU-23 traen pruebas de modelo con pytest: cada una intenta guardar algo que el anexo A prohíbe y comprueba que PostgreSQL lo rechaza sin pasar por el código de la aplicación. La rama de la demo, demo/semana-08, agrega un script de restricciones que hace veinte intentos sobre las bases levantadas. En la verificación del 30-09, hecha sobre un esquema equivalente en PostgreSQL 16, la base rechazó los diecinueve inválidos y aceptó el válido, que se incluyó a propósito: un bloque encima de otro eliminado.</w:t>
+        <w:t xml:space="preserve">Los PR de HU-04, HU-07, HU-08 y HU-23 (#5 a #8) incluyeron pruebas de modelo con pytest: cada una intenta guardar algo que el anexo A prohíbe y comprueba que PostgreSQL lo rechaza sin pasar por el código de la aplicación. El script scripts/probar_restricciones.ps1, que llegó a develop con el PR #16, hace veinte intentos sobre las bases levantadas. En la verificación del 30-09, hecha sobre un esquema equivalente en PostgreSQL 16, la base rechazó los diecinueve inválidos y aceptó el válido, que se incluyó a propósito: un bloque encima de otro eliminado.</w:t>
       </w:r>
     </w:p>
     <w:p>
@@ -8717,7 +8778,7 @@
         <w:jc w:val="left"/>
       </w:pPr>
       <w:r>
-        <w:t xml:space="preserve">El plan de pruebas de cada sprint está en su Sprint Planning (carpeta de cada sprint), y los resultados, en su Sprint Review. Así la evidencia de pruebas queda por sprint, como pide el instructivo.</w:t>
+        <w:t xml:space="preserve">El plan de pruebas de cada sprint está en su Sprint Planning (carpeta de cada sprint) y los resultados en su Sprint Review: la evidencia de pruebas queda por sprint, como pide el instructivo.</w:t>
       </w:r>
     </w:p>
     <w:sectPr>

</xml_diff>